<commit_message>
court(wva): reply brief gated on latex (docx reported: LibreOffice note placement), amicus reason updated, engines regenerated (fb-595.54.21)
Co-Authored-By: Claude Opus 5.5 <noreply@anthropic.com>
</commit_message>
<xml_diff>
--- a/courts/fourth-circuit/west-virginia/state/supreme-court/amicus-brief/usage/OUTPUT-amicus-brief.docx
+++ b/courts/fourth-circuit/west-virginia/state/supreme-court/amicus-brief/usage/OUTPUT-amicus-brief.docx
@@ -12039,7 +12039,7 @@
         <w:t xml:space="preserve"> </w:t>
       </w:r>
       <w:r>
-        <w:t xml:space="preserve">New public nuisance lawsuits typically target companies that “manufacture products that may be used by third parties to harm others or that . . . plaintiffs view as contributing to some larger social ill.”</w:t>
+        <w:t xml:space="preserve">New public nuisance lawsuits typically target companies that “manufacture products that may be used by third parties to harm others or that . . . plaintiffs view as contributing to some larger social ill.”</w:t>
       </w:r>
       <w:r>
         <w:rPr>
@@ -13705,19 +13705,7 @@
         <w:pStyle w:val="BodyText"/>
       </w:pPr>
       <w:r>
-        <w:t xml:space="preserve">Opioids are also extensively regulated by, among other things, the West Virginia Uniform Controlled Substances Act, West Virginia Code § 60A</w:t>
-      </w:r>
-      <w:r>
-        <w:noBreakHyphen/>
-      </w:r>
-      <w:r>
-        <w:t xml:space="preserve">2</w:t>
-      </w:r>
-      <w:r>
-        <w:noBreakHyphen/>
-      </w:r>
-      <w:r>
-        <w:t xml:space="preserve">201</w:t>
+        <w:t xml:space="preserve">Opioids are also extensively regulated by, among other things, the West Virginia Uniform Controlled Substances Act, West Virginia Code § 60A-⁠2-⁠201</w:t>
       </w:r>
       <w:r>
         <w:t xml:space="preserve"> </w:t>
@@ -13730,19 +13718,7 @@
         <w:t xml:space="preserve">et seq.</w:t>
       </w:r>
       <w:r>
-        <w:t xml:space="preserve">, The Larry W. Border Pharmacy Practice Act, West Virginia Code § 30</w:t>
-      </w:r>
-      <w:r>
-        <w:noBreakHyphen/>
-      </w:r>
-      <w:r>
-        <w:t xml:space="preserve">5</w:t>
-      </w:r>
-      <w:r>
-        <w:noBreakHyphen/>
-      </w:r>
-      <w:r>
-        <w:t xml:space="preserve">1</w:t>
+        <w:t xml:space="preserve">, The Larry W. Border Pharmacy Practice Act, West Virginia Code § 30-⁠5-⁠1</w:t>
       </w:r>
       <w:r>
         <w:t xml:space="preserve"> </w:t>
@@ -15743,7 +15719,7 @@
         <w:t xml:space="preserve"> </w:t>
       </w:r>
       <w:r>
-        <w:t xml:space="preserve">Based on petitioners’ argument, an accumulation of individual hurts or inconveniences is enough to trigger liability. But under well-established public nuisance law, and due process standards, more must be proven than interference with general notions of health, safety, and welfare. As this Court has rightly acknowledged: “Tort law is essentially a recognition of limitations expressing finite boundaries of recovery. . . . It is a question of public policy. Each segment of society will suffer injustice, whether situated as plaintiff or defendant, if there are no finite boundaries to liability[.]”</w:t>
+        <w:t xml:space="preserve">Based on petitioners’ argument, an accumulation of individual hurts or inconveniences is enough to trigger liability. But under well-established public nuisance law, and due process standards, more must be proven than interference with general notions of health, safety, and welfare. As this Court has rightly acknowledged: “Tort law is essentially a recognition of limitations expressing finite boundaries of recovery. . . . It is a question of public policy. Each segment of society will suffer injustice, whether situated as plaintiff or defendant, if there are no finite boundaries to liability[.]”</w:t>
       </w:r>
       <w:r>
         <w:t xml:space="preserve"> </w:t>
@@ -16253,7 +16229,7 @@
         <w:t xml:space="preserve">v. Beretta U.S.A. Corp.</w:t>
       </w:r>
       <w:r>
-        <w:t xml:space="preserve">, 277 F.3d 415, 422 (3d Cir. 2002) (holding that because “the gun manufacturers do not exercise significant control over the source of the interference with the public right . . . the causal chain is too attenuated to make out a public nuisance claim”). Under West Virginia law, to establish an abatable public nuisance, a plaintiff must prove both “the injury and the proximate cause.”</w:t>
+        <w:t xml:space="preserve">, 277 F.3d 415, 422 (3d Cir. 2002) (holding that because “the gun manufacturers do not exercise significant control over the source of the interference with the public right . . . the causal chain is too attenuated to make out a public nuisance claim”). Under West Virginia law, to establish an abatable public nuisance, a plaintiff must prove both “the injury and the proximate cause.”</w:t>
       </w:r>
       <w:r>
         <w:t xml:space="preserve"> </w:t>
@@ -18475,7 +18451,7 @@
         <w:t xml:space="preserve"> </w:t>
       </w:r>
       <w:r>
-        <w:t xml:space="preserve">Opioid Settlement Payouts Are Now Public—And We Know How Much Local Governments Got, available at https://​​www.​npr.​org/​​sections/​​health-​shots/​​2023/​​06/​​16/​​1182580973/​​opioid-​settlement-​fund-​amounts#:~:text=The%20national%20opioid%20settlements%20are%20the%20second-​largest%20public,now%20largely%20transitioned%20to%20illicit%20drugs%2C%20like%20fentanyl, last visited on May 19, 2024.</w:t>
+        <w:t xml:space="preserve">Opioid Settlement Payouts Are Now Public—And We Know How Much Local Governments Got, available at https://​www.​npr.​org/​sections/​health-​shots/​2023/​06/​16/​1182580973/​opioid-​settlement-​fund-​amounts#:~:text=The%20national%20opioid%20settlements%20are%20the%20second-​largest%20public,now%20largely%20transitioned%20to%20illicit%20drugs%2C%20like%20fentanyl, last visited on May 19, 2024.</w:t>
       </w:r>
     </w:p>
   </w:footnote>
@@ -18563,13 +18539,7 @@
         <w:t xml:space="preserve"> </w:t>
       </w:r>
       <w:r>
-        <w:t xml:space="preserve">See, e.g., Restatement (Third) of Torts: Products Liabilty §§ 1</w:t>
-      </w:r>
-      <w:r>
-        <w:noBreakHyphen/>
-      </w:r>
-      <w:r>
-        <w:t xml:space="preserve">2, 15 (1998).</w:t>
+        <w:t xml:space="preserve">See, e.g., Restatement (Third) of Torts: Products Liabilty §§ 1-⁠2, 15 (1998).</w:t>
       </w:r>
     </w:p>
   </w:footnote>
@@ -18868,7 +18838,7 @@
         <w:t xml:space="preserve"> </w:t>
       </w:r>
       <w:r>
-        <w:t xml:space="preserve">65 W. Va. 700, 64 S.E. 935, 938–39 (1909) (describing an “extensive class of cases . . . composed of those having for their object the vindication of public rights in respect to property, such as obstructions to highways, public grounds, harbors, and landings,” in which “the Attorney General may proceed in equity on behalf of the public to abate the nuisance, if it be one”) (emphasis added); State v. Baltimore &amp; O.R.</w:t>
+        <w:t xml:space="preserve">65 W. Va. 700, 64 S.E. 935, 938–39 (1909) (describing an “extensive class of cases . . . composed of those having for their object the vindication of public rights in respect to property, such as obstructions to highways, public grounds, harbors, and landings,” in which “the Attorney General may proceed in equity on behalf of the public to abate the nuisance, if it be one”) (emphasis added); State v. Baltimore &amp; O.R.</w:t>
       </w:r>
       <w:r>
         <w:t xml:space="preserve"> </w:t>
@@ -20050,6 +20020,33 @@
       <w:ind w:left="2160" w:hanging="720"/>
     </w:pPr>
   </w:style>
+  <w:style w:type="paragraph" w:customStyle="1" w:styleId="XdQuoteList1">
+    <w:name w:val="Xd Quote List 1"/>
+    <w:basedOn w:val="Normal"/>
+    <w:qFormat/>
+    <w:pPr>
+      <w:spacing w:before="0" w:after="0" w:line="276" w:lineRule="exact"/>
+      <w:ind w:left="1440" w:right="720" w:hanging="720"/>
+    </w:pPr>
+  </w:style>
+  <w:style w:type="paragraph" w:customStyle="1" w:styleId="XdQuoteList2">
+    <w:name w:val="Xd Quote List 2"/>
+    <w:basedOn w:val="Normal"/>
+    <w:qFormat/>
+    <w:pPr>
+      <w:spacing w:before="0" w:after="0" w:line="276" w:lineRule="exact"/>
+      <w:ind w:left="2160" w:right="720" w:hanging="720"/>
+    </w:pPr>
+  </w:style>
+  <w:style w:type="paragraph" w:customStyle="1" w:styleId="XdQuoteList3">
+    <w:name w:val="Xd Quote List 3"/>
+    <w:basedOn w:val="Normal"/>
+    <w:qFormat/>
+    <w:pPr>
+      <w:spacing w:before="0" w:after="0" w:line="276" w:lineRule="exact"/>
+      <w:ind w:left="2880" w:right="720" w:hanging="720"/>
+    </w:pPr>
+  </w:style>
   <w:style w:type="paragraph" w:customStyle="1" w:styleId="SourceCode">
     <w:name w:val="Source Code"/>
     <w:basedOn w:val="Normal"/>

</xml_diff>